<commit_message>
Colocation : un locataire au départ, bouton « Ajouter », garant par colocataire
Le formulaire du bail n'affiche plus qu'une ligne de locataire ; le bouton
« + Ajouter un locataire » en ajoute jusqu'à six, sans recharger la page.
Chaque locataire peut avoir son garant, et une case « colocation »
apparaît dès le deuxième locataire.

Dans le bail, une colocation ajoute la mention de l'article 8-1 de la loi
du 6 juillet 1989 et la clause de solidarité ALUR : la solidarité d'un
colocataire qui part, et celle de sa caution, cessent quand un remplaçant
figure au bail, au plus tard six mois après son congé.

Co-Authored-By: Claude Opus 5.5 (1M context) <noreply@anthropic.com>
Claude-Session: https://claude.ai/code/session_011hkPGmXBpj4i7qebVZue98
</commit_message>
<xml_diff>
--- a/documents/modeles/bail_habitation.docx
+++ b/documents/modeles/bail_habitation.docx
@@ -339,6 +339,60 @@
           <w:sz w:val="20"/>
           <w:u w:val="none"/>
         </w:rPr>
+        <w:t>{%p if locataire.garant %}</w:t>
+      </w:r>
+    </w:p>
+    <w:p>
+      <w:pPr>
+        <w:spacing w:before="0" w:after="40"/>
+        <w:jc w:val="both"/>
+      </w:pPr>
+      <w:r>
+        <w:rPr>
+          <w:rFonts w:ascii="Blogger Sans Light" w:hAnsi="Blogger Sans Light"/>
+          <w:b/>
+          <w:sz w:val="20"/>
+          <w:u w:val="none"/>
+        </w:rPr>
+        <w:t xml:space="preserve">Garant de ce locataire : </w:t>
+      </w:r>
+      <w:r>
+        <w:rPr>
+          <w:rFonts w:ascii="Blogger Sans Light" w:hAnsi="Blogger Sans Light"/>
+          <w:b w:val="0"/>
+          <w:sz w:val="20"/>
+          <w:u w:val="none"/>
+        </w:rPr>
+        <w:t>{{ locataire.garant }}</w:t>
+      </w:r>
+    </w:p>
+    <w:p>
+      <w:pPr>
+        <w:spacing w:before="0" w:after="0"/>
+        <w:jc w:val="both"/>
+      </w:pPr>
+      <w:r>
+        <w:rPr>
+          <w:rFonts w:ascii="Blogger Sans Light" w:hAnsi="Blogger Sans Light"/>
+          <w:b w:val="0"/>
+          <w:sz w:val="20"/>
+          <w:u w:val="none"/>
+        </w:rPr>
+        <w:t>{%p endif %}</w:t>
+      </w:r>
+    </w:p>
+    <w:p>
+      <w:pPr>
+        <w:spacing w:before="0" w:after="0"/>
+        <w:jc w:val="both"/>
+      </w:pPr>
+      <w:r>
+        <w:rPr>
+          <w:rFonts w:ascii="Blogger Sans Light" w:hAnsi="Blogger Sans Light"/>
+          <w:b w:val="0"/>
+          <w:sz w:val="20"/>
+          <w:u w:val="none"/>
+        </w:rPr>
         <w:t>{%p endfor %}</w:t>
       </w:r>
     </w:p>
@@ -355,6 +409,51 @@
           <w:u w:val="none"/>
         </w:rPr>
         <w:t>désigné(s) ci-après « le locataire » ;</w:t>
+      </w:r>
+    </w:p>
+    <w:p>
+      <w:pPr>
+        <w:spacing w:before="0" w:after="0"/>
+        <w:jc w:val="both"/>
+      </w:pPr>
+      <w:r>
+        <w:rPr>
+          <w:rFonts w:ascii="Blogger Sans Light" w:hAnsi="Blogger Sans Light"/>
+          <w:b w:val="0"/>
+          <w:sz w:val="20"/>
+          <w:u w:val="none"/>
+        </w:rPr>
+        <w:t>{%p if colocation %}</w:t>
+      </w:r>
+    </w:p>
+    <w:p>
+      <w:pPr>
+        <w:spacing w:before="0" w:after="80"/>
+        <w:jc w:val="both"/>
+      </w:pPr>
+      <w:r>
+        <w:rPr>
+          <w:rFonts w:ascii="Blogger Sans Light" w:hAnsi="Blogger Sans Light"/>
+          <w:b w:val="0"/>
+          <w:sz w:val="20"/>
+          <w:u w:val="none"/>
+        </w:rPr>
+        <w:t>Le logement est loué en colocation, au sens de l'article 8-1 de la loi n° 89-462 du 6 juillet 1989, à l'ensemble des locataires désignés ci-dessus, par un bail unique.</w:t>
+      </w:r>
+    </w:p>
+    <w:p>
+      <w:pPr>
+        <w:spacing w:before="0" w:after="0"/>
+        <w:jc w:val="both"/>
+      </w:pPr>
+      <w:r>
+        <w:rPr>
+          <w:rFonts w:ascii="Blogger Sans Light" w:hAnsi="Blogger Sans Light"/>
+          <w:b w:val="0"/>
+          <w:sz w:val="20"/>
+          <w:u w:val="none"/>
+        </w:rPr>
+        <w:t>{%p endif %}</w:t>
       </w:r>
     </w:p>
     <w:p>
@@ -1527,7 +1626,7 @@
           <w:sz w:val="20"/>
           <w:u w:val="none"/>
         </w:rPr>
-        <w:t>Les locataires sont tenus solidairement et indivisiblement de l'ensemble des obligations découlant du présent contrat, notamment du paiement du loyer, des charges et des réparations locatives. Cette solidarité cesse dans les conditions prévues par l'article 8-1 de la loi n° 89-462 du 6 juillet 1989.</w:t>
+        <w:t>{{ texte_solidarite }}</w:t>
       </w:r>
     </w:p>
     <w:p>

</xml_diff>

<commit_message>
Colocation : un locataire au départ, bouton « Ajouter », garant par colocataire (#13)
Le formulaire du bail n'affiche plus qu'une ligne de locataire ; le bouton
« + Ajouter un locataire » en ajoute jusqu'à six, sans recharger la page.
Chaque locataire peut avoir son garant, et une case « colocation »
apparaît dès le deuxième locataire.

Dans le bail, une colocation ajoute la mention de l'article 8-1 de la loi
du 6 juillet 1989 et la clause de solidarité ALUR : la solidarité d'un
colocataire qui part, et celle de sa caution, cessent quand un remplaçant
figure au bail, au plus tard six mois après son congé.


Claude-Session: https://claude.ai/code/session_011hkPGmXBpj4i7qebVZue98

Co-authored-by: Claude <noreply@anthropic.com>
</commit_message>
<xml_diff>
--- a/documents/modeles/bail_habitation.docx
+++ b/documents/modeles/bail_habitation.docx
@@ -339,6 +339,60 @@
           <w:sz w:val="20"/>
           <w:u w:val="none"/>
         </w:rPr>
+        <w:t>{%p if locataire.garant %}</w:t>
+      </w:r>
+    </w:p>
+    <w:p>
+      <w:pPr>
+        <w:spacing w:before="0" w:after="40"/>
+        <w:jc w:val="both"/>
+      </w:pPr>
+      <w:r>
+        <w:rPr>
+          <w:rFonts w:ascii="Blogger Sans Light" w:hAnsi="Blogger Sans Light"/>
+          <w:b/>
+          <w:sz w:val="20"/>
+          <w:u w:val="none"/>
+        </w:rPr>
+        <w:t xml:space="preserve">Garant de ce locataire : </w:t>
+      </w:r>
+      <w:r>
+        <w:rPr>
+          <w:rFonts w:ascii="Blogger Sans Light" w:hAnsi="Blogger Sans Light"/>
+          <w:b w:val="0"/>
+          <w:sz w:val="20"/>
+          <w:u w:val="none"/>
+        </w:rPr>
+        <w:t>{{ locataire.garant }}</w:t>
+      </w:r>
+    </w:p>
+    <w:p>
+      <w:pPr>
+        <w:spacing w:before="0" w:after="0"/>
+        <w:jc w:val="both"/>
+      </w:pPr>
+      <w:r>
+        <w:rPr>
+          <w:rFonts w:ascii="Blogger Sans Light" w:hAnsi="Blogger Sans Light"/>
+          <w:b w:val="0"/>
+          <w:sz w:val="20"/>
+          <w:u w:val="none"/>
+        </w:rPr>
+        <w:t>{%p endif %}</w:t>
+      </w:r>
+    </w:p>
+    <w:p>
+      <w:pPr>
+        <w:spacing w:before="0" w:after="0"/>
+        <w:jc w:val="both"/>
+      </w:pPr>
+      <w:r>
+        <w:rPr>
+          <w:rFonts w:ascii="Blogger Sans Light" w:hAnsi="Blogger Sans Light"/>
+          <w:b w:val="0"/>
+          <w:sz w:val="20"/>
+          <w:u w:val="none"/>
+        </w:rPr>
         <w:t>{%p endfor %}</w:t>
       </w:r>
     </w:p>
@@ -355,6 +409,51 @@
           <w:u w:val="none"/>
         </w:rPr>
         <w:t>désigné(s) ci-après « le locataire » ;</w:t>
+      </w:r>
+    </w:p>
+    <w:p>
+      <w:pPr>
+        <w:spacing w:before="0" w:after="0"/>
+        <w:jc w:val="both"/>
+      </w:pPr>
+      <w:r>
+        <w:rPr>
+          <w:rFonts w:ascii="Blogger Sans Light" w:hAnsi="Blogger Sans Light"/>
+          <w:b w:val="0"/>
+          <w:sz w:val="20"/>
+          <w:u w:val="none"/>
+        </w:rPr>
+        <w:t>{%p if colocation %}</w:t>
+      </w:r>
+    </w:p>
+    <w:p>
+      <w:pPr>
+        <w:spacing w:before="0" w:after="80"/>
+        <w:jc w:val="both"/>
+      </w:pPr>
+      <w:r>
+        <w:rPr>
+          <w:rFonts w:ascii="Blogger Sans Light" w:hAnsi="Blogger Sans Light"/>
+          <w:b w:val="0"/>
+          <w:sz w:val="20"/>
+          <w:u w:val="none"/>
+        </w:rPr>
+        <w:t>Le logement est loué en colocation, au sens de l'article 8-1 de la loi n° 89-462 du 6 juillet 1989, à l'ensemble des locataires désignés ci-dessus, par un bail unique.</w:t>
+      </w:r>
+    </w:p>
+    <w:p>
+      <w:pPr>
+        <w:spacing w:before="0" w:after="0"/>
+        <w:jc w:val="both"/>
+      </w:pPr>
+      <w:r>
+        <w:rPr>
+          <w:rFonts w:ascii="Blogger Sans Light" w:hAnsi="Blogger Sans Light"/>
+          <w:b w:val="0"/>
+          <w:sz w:val="20"/>
+          <w:u w:val="none"/>
+        </w:rPr>
+        <w:t>{%p endif %}</w:t>
       </w:r>
     </w:p>
     <w:p>
@@ -1527,7 +1626,7 @@
           <w:sz w:val="20"/>
           <w:u w:val="none"/>
         </w:rPr>
-        <w:t>Les locataires sont tenus solidairement et indivisiblement de l'ensemble des obligations découlant du présent contrat, notamment du paiement du loyer, des charges et des réparations locatives. Cette solidarité cesse dans les conditions prévues par l'article 8-1 de la loi n° 89-462 du 6 juillet 1989.</w:t>
+        <w:t>{{ texte_solidarite }}</w:t>
       </w:r>
     </w:p>
     <w:p>

</xml_diff>

<commit_message>
Plusieurs garants par locataire
Dans le formulaire reçu par lien, chaque locataire peut déclarer jusqu'à deux
garants (identité, adresse, contact) ; la candidature passe alors en
« caution personne physique ». Côté bail, les champs « garant » deviennent
« garants », une caution par ligne (migration qui garde les valeurs
saisies), et le document mentionne chacune d'elles.

Co-Authored-By: Claude Opus 5.5 (1M context) <noreply@anthropic.com>
Claude-Session: https://claude.ai/code/session_011hkPGmXBpj4i7qebVZue98
</commit_message>
<xml_diff>
--- a/documents/modeles/bail_habitation.docx
+++ b/documents/modeles/bail_habitation.docx
@@ -339,7 +339,7 @@
           <w:sz w:val="20"/>
           <w:u w:val="none"/>
         </w:rPr>
-        <w:t>{%p if locataire.garant %}</w:t>
+        <w:t>{%p for caution in locataire.garants %}</w:t>
       </w:r>
     </w:p>
     <w:p>
@@ -363,7 +363,7 @@
           <w:sz w:val="20"/>
           <w:u w:val="none"/>
         </w:rPr>
-        <w:t>{{ locataire.garant }}</w:t>
+        <w:t>{{ caution }}</w:t>
       </w:r>
     </w:p>
     <w:p>
@@ -378,6 +378,81 @@
           <w:sz w:val="20"/>
           <w:u w:val="none"/>
         </w:rPr>
+        <w:t>{%p endfor %}</w:t>
+      </w:r>
+    </w:p>
+    <w:p>
+      <w:pPr>
+        <w:spacing w:before="0" w:after="0"/>
+        <w:jc w:val="both"/>
+      </w:pPr>
+      <w:r>
+        <w:rPr>
+          <w:rFonts w:ascii="Blogger Sans Light" w:hAnsi="Blogger Sans Light"/>
+          <w:b w:val="0"/>
+          <w:sz w:val="20"/>
+          <w:u w:val="none"/>
+        </w:rPr>
+        <w:t>{%p endfor %}</w:t>
+      </w:r>
+    </w:p>
+    <w:p>
+      <w:pPr>
+        <w:spacing w:before="0" w:after="80"/>
+        <w:jc w:val="both"/>
+      </w:pPr>
+      <w:r>
+        <w:rPr>
+          <w:rFonts w:ascii="Blogger Sans Light" w:hAnsi="Blogger Sans Light"/>
+          <w:b w:val="0"/>
+          <w:sz w:val="20"/>
+          <w:u w:val="none"/>
+        </w:rPr>
+        <w:t>désigné(s) ci-après « le locataire » ;</w:t>
+      </w:r>
+    </w:p>
+    <w:p>
+      <w:pPr>
+        <w:spacing w:before="0" w:after="0"/>
+        <w:jc w:val="both"/>
+      </w:pPr>
+      <w:r>
+        <w:rPr>
+          <w:rFonts w:ascii="Blogger Sans Light" w:hAnsi="Blogger Sans Light"/>
+          <w:b w:val="0"/>
+          <w:sz w:val="20"/>
+          <w:u w:val="none"/>
+        </w:rPr>
+        <w:t>{%p if colocation %}</w:t>
+      </w:r>
+    </w:p>
+    <w:p>
+      <w:pPr>
+        <w:spacing w:before="0" w:after="80"/>
+        <w:jc w:val="both"/>
+      </w:pPr>
+      <w:r>
+        <w:rPr>
+          <w:rFonts w:ascii="Blogger Sans Light" w:hAnsi="Blogger Sans Light"/>
+          <w:b w:val="0"/>
+          <w:sz w:val="20"/>
+          <w:u w:val="none"/>
+        </w:rPr>
+        <w:t>Le logement est loué en colocation, au sens de l'article 8-1 de la loi n° 89-462 du 6 juillet 1989, à l'ensemble des locataires désignés ci-dessus, par un bail unique.</w:t>
+      </w:r>
+    </w:p>
+    <w:p>
+      <w:pPr>
+        <w:spacing w:before="0" w:after="0"/>
+        <w:jc w:val="both"/>
+      </w:pPr>
+      <w:r>
+        <w:rPr>
+          <w:rFonts w:ascii="Blogger Sans Light" w:hAnsi="Blogger Sans Light"/>
+          <w:b w:val="0"/>
+          <w:sz w:val="20"/>
+          <w:u w:val="none"/>
+        </w:rPr>
         <w:t>{%p endif %}</w:t>
       </w:r>
     </w:p>
@@ -393,121 +468,46 @@
           <w:sz w:val="20"/>
           <w:u w:val="none"/>
         </w:rPr>
+        <w:t>{%p for caution in garants %}</w:t>
+      </w:r>
+    </w:p>
+    <w:p>
+      <w:pPr>
+        <w:spacing w:before="0" w:after="40"/>
+        <w:jc w:val="both"/>
+      </w:pPr>
+      <w:r>
+        <w:rPr>
+          <w:rFonts w:ascii="Blogger Sans Light" w:hAnsi="Blogger Sans Light"/>
+          <w:b/>
+          <w:sz w:val="20"/>
+          <w:u w:val="none"/>
+        </w:rPr>
+        <w:t xml:space="preserve">Garant : </w:t>
+      </w:r>
+      <w:r>
+        <w:rPr>
+          <w:rFonts w:ascii="Blogger Sans Light" w:hAnsi="Blogger Sans Light"/>
+          <w:b w:val="0"/>
+          <w:sz w:val="20"/>
+          <w:u w:val="none"/>
+        </w:rPr>
+        <w:t>{{ caution }}</w:t>
+      </w:r>
+    </w:p>
+    <w:p>
+      <w:pPr>
+        <w:spacing w:before="0" w:after="0"/>
+        <w:jc w:val="both"/>
+      </w:pPr>
+      <w:r>
+        <w:rPr>
+          <w:rFonts w:ascii="Blogger Sans Light" w:hAnsi="Blogger Sans Light"/>
+          <w:b w:val="0"/>
+          <w:sz w:val="20"/>
+          <w:u w:val="none"/>
+        </w:rPr>
         <w:t>{%p endfor %}</w:t>
-      </w:r>
-    </w:p>
-    <w:p>
-      <w:pPr>
-        <w:spacing w:before="0" w:after="80"/>
-        <w:jc w:val="both"/>
-      </w:pPr>
-      <w:r>
-        <w:rPr>
-          <w:rFonts w:ascii="Blogger Sans Light" w:hAnsi="Blogger Sans Light"/>
-          <w:b w:val="0"/>
-          <w:sz w:val="20"/>
-          <w:u w:val="none"/>
-        </w:rPr>
-        <w:t>désigné(s) ci-après « le locataire » ;</w:t>
-      </w:r>
-    </w:p>
-    <w:p>
-      <w:pPr>
-        <w:spacing w:before="0" w:after="0"/>
-        <w:jc w:val="both"/>
-      </w:pPr>
-      <w:r>
-        <w:rPr>
-          <w:rFonts w:ascii="Blogger Sans Light" w:hAnsi="Blogger Sans Light"/>
-          <w:b w:val="0"/>
-          <w:sz w:val="20"/>
-          <w:u w:val="none"/>
-        </w:rPr>
-        <w:t>{%p if colocation %}</w:t>
-      </w:r>
-    </w:p>
-    <w:p>
-      <w:pPr>
-        <w:spacing w:before="0" w:after="80"/>
-        <w:jc w:val="both"/>
-      </w:pPr>
-      <w:r>
-        <w:rPr>
-          <w:rFonts w:ascii="Blogger Sans Light" w:hAnsi="Blogger Sans Light"/>
-          <w:b w:val="0"/>
-          <w:sz w:val="20"/>
-          <w:u w:val="none"/>
-        </w:rPr>
-        <w:t>Le logement est loué en colocation, au sens de l'article 8-1 de la loi n° 89-462 du 6 juillet 1989, à l'ensemble des locataires désignés ci-dessus, par un bail unique.</w:t>
-      </w:r>
-    </w:p>
-    <w:p>
-      <w:pPr>
-        <w:spacing w:before="0" w:after="0"/>
-        <w:jc w:val="both"/>
-      </w:pPr>
-      <w:r>
-        <w:rPr>
-          <w:rFonts w:ascii="Blogger Sans Light" w:hAnsi="Blogger Sans Light"/>
-          <w:b w:val="0"/>
-          <w:sz w:val="20"/>
-          <w:u w:val="none"/>
-        </w:rPr>
-        <w:t>{%p endif %}</w:t>
-      </w:r>
-    </w:p>
-    <w:p>
-      <w:pPr>
-        <w:spacing w:before="0" w:after="0"/>
-        <w:jc w:val="both"/>
-      </w:pPr>
-      <w:r>
-        <w:rPr>
-          <w:rFonts w:ascii="Blogger Sans Light" w:hAnsi="Blogger Sans Light"/>
-          <w:b w:val="0"/>
-          <w:sz w:val="20"/>
-          <w:u w:val="none"/>
-        </w:rPr>
-        <w:t>{%p if garant %}</w:t>
-      </w:r>
-    </w:p>
-    <w:p>
-      <w:pPr>
-        <w:spacing w:before="0" w:after="40"/>
-        <w:jc w:val="both"/>
-      </w:pPr>
-      <w:r>
-        <w:rPr>
-          <w:rFonts w:ascii="Blogger Sans Light" w:hAnsi="Blogger Sans Light"/>
-          <w:b/>
-          <w:sz w:val="20"/>
-          <w:u w:val="none"/>
-        </w:rPr>
-        <w:t xml:space="preserve">Garant : </w:t>
-      </w:r>
-      <w:r>
-        <w:rPr>
-          <w:rFonts w:ascii="Blogger Sans Light" w:hAnsi="Blogger Sans Light"/>
-          <w:b w:val="0"/>
-          <w:sz w:val="20"/>
-          <w:u w:val="none"/>
-        </w:rPr>
-        <w:t>{{ garant }}</w:t>
-      </w:r>
-    </w:p>
-    <w:p>
-      <w:pPr>
-        <w:spacing w:before="0" w:after="0"/>
-        <w:jc w:val="both"/>
-      </w:pPr>
-      <w:r>
-        <w:rPr>
-          <w:rFonts w:ascii="Blogger Sans Light" w:hAnsi="Blogger Sans Light"/>
-          <w:b w:val="0"/>
-          <w:sz w:val="20"/>
-          <w:u w:val="none"/>
-        </w:rPr>
-        <w:t>{%p endif %}</w:t>
       </w:r>
     </w:p>
     <w:p>

</xml_diff>

<commit_message>
Fiche de l'agence : coordonnées et mentions légales en base
- Nouveau modèle core.Organisation (une fiche par installation) : identité,
  coordonnées, carte professionnelle, garantie financière, logo, taux
  d'honoraires de gestion proposé.
- Écran « Agence » réservé aux administrateurs, avec historique ; l'accueil
  signale les mentions manquantes.
- Modèles Word : les coordonnées écrites en dur deviennent des balises
  {{ agence.… }}.
- Messages aux candidats et formulaire public signés du nom de l'agence.
- Reprise des coordonnées d'URBIA sur une base déjà en service ; une
  installation neuve part d'une fiche vide.

Co-Authored-By: Claude Opus 5.5 <noreply@anthropic.com>
</commit_message>
<xml_diff>
--- a/documents/modeles/bail_habitation.docx
+++ b/documents/modeles/bail_habitation.docx
@@ -231,7 +231,7 @@
           <w:sz w:val="20"/>
           <w:u w:val="none"/>
         </w:rPr>
-        <w:t>Représenté par son mandataire : URBIA IMMOBILIER, 302 avenue de Muret, 31300 Toulouse, exerçant l'activité de gestion immobilière, titulaire de la carte professionnelle CPI 3101 2017 000 016 956 délivrée par la CCI de la Haute-Garonne, garantie financière assurée par GALIAN, 89 rue La Boétie, 75008 Paris.</w:t>
+        <w:t xml:space="preserve">Représenté par son mandataire : {{ agence.nom|upper }}, {{ agence.adresse }}, {{ agence.code_postal }} {{ agence.ville }}, exerçant l'activité de gestion immobilière, titulaire de la carte professionnelle {{ agence.carte_pro }} délivrée par {{ agence.carte_delivree_par }}, garantie financière assurée par {{ agence.garant }}, {{ agence.garant_adresse }}.</w:t>
       </w:r>
     </w:p>
     <w:p>
@@ -5263,7 +5263,7 @@
               <w:b/>
               <w:color w:val="767171" w:themeColor="background2" w:themeShade="80"/>
             </w:rPr>
-            <w:t>URBIA IMMOBILIER</w:t>
+            <w:t xml:space="preserve">{{ agence.nom|upper }}</w:t>
           </w:r>
         </w:p>
         <w:p>
@@ -5284,7 +5284,7 @@
               <w:rFonts w:ascii="Blogger Sans Light" w:eastAsia="Calibri" w:hAnsi="Blogger Sans Light"/>
               <w:color w:val="767171" w:themeColor="background2" w:themeShade="80"/>
             </w:rPr>
-            <w:t>302 Avenue de Muret</w:t>
+            <w:t xml:space="preserve">{{ agence.adresse }}</w:t>
           </w:r>
         </w:p>
         <w:p>
@@ -5305,21 +5305,21 @@
               <w:rFonts w:ascii="Blogger Sans Light" w:eastAsia="Calibri" w:hAnsi="Blogger Sans Light"/>
               <w:color w:val="767171" w:themeColor="background2" w:themeShade="80"/>
             </w:rPr>
-            <w:t>31</w:t>
+            <w:t xml:space="preserve">{{ agence.code_postal }} {{ agence.ville|upper }}</w:t>
           </w:r>
           <w:r>
             <w:rPr>
               <w:rFonts w:ascii="Blogger Sans Light" w:eastAsia="Calibri" w:hAnsi="Blogger Sans Light"/>
               <w:color w:val="767171" w:themeColor="background2" w:themeShade="80"/>
             </w:rPr>
-            <w:t>3</w:t>
+            <w:t xml:space="preserve"/>
           </w:r>
           <w:r>
             <w:rPr>
               <w:rFonts w:ascii="Blogger Sans Light" w:eastAsia="Calibri" w:hAnsi="Blogger Sans Light"/>
               <w:color w:val="767171" w:themeColor="background2" w:themeShade="80"/>
             </w:rPr>
-            <w:t>00 TOULOUSE</w:t>
+            <w:t xml:space="preserve"/>
           </w:r>
         </w:p>
         <w:p>
@@ -5340,7 +5340,7 @@
               <w:rFonts w:ascii="Blogger Sans Light" w:eastAsia="Calibri" w:hAnsi="Blogger Sans Light"/>
               <w:color w:val="767171" w:themeColor="background2" w:themeShade="80"/>
             </w:rPr>
-            <w:t xml:space="preserve">                                         contact@urbia-immobilier.fr</w:t>
+            <w:t xml:space="preserve">                                         {{ agence.email }}</w:t>
           </w:r>
         </w:p>
         <w:p>
@@ -5440,14 +5440,14 @@
               <w:rFonts w:ascii="Calibri" w:eastAsia="Calibri" w:hAnsi="Calibri" w:cs="Calibri"/>
               <w:color w:val="767171" w:themeColor="background2" w:themeShade="80"/>
             </w:rPr>
-            <w:t> </w:t>
+            <w:t xml:space="preserve"> </w:t>
           </w:r>
           <w:r>
             <w:rPr>
               <w:rFonts w:ascii="Blogger Sans Light" w:eastAsia="Calibri" w:hAnsi="Blogger Sans Light"/>
               <w:color w:val="767171" w:themeColor="background2" w:themeShade="80"/>
             </w:rPr>
-            <w:t>05.32.26.15.25</w:t>
+            <w:t xml:space="preserve">{{ agence.telephone }}</w:t>
           </w:r>
         </w:p>
       </w:tc>

</xml_diff>

<commit_message>
Fiche de l'agence : coordonnées et mentions légales en base (#31)
* Fiche de l'agence : coordonnées et mentions légales en base

- Nouveau modèle core.Organisation (une fiche par installation) : identité,
  coordonnées, carte professionnelle, garantie financière, logo, taux
  d'honoraires de gestion proposé.
- Écran « Agence » réservé aux administrateurs, avec historique ; l'accueil
  signale les mentions manquantes.
- Modèles Word : les coordonnées écrites en dur deviennent des balises
  {{ agence.… }}.
- Messages aux candidats et formulaire public signés du nom de l'agence.
- Reprise des coordonnées d'URBIA sur une base déjà en service ; une
  installation neuve part d'une fiche vide.

Co-Authored-By: Claude Opus 5.5 <noreply@anthropic.com>

* Test du logo : ne pas fermer la réponse, la connexion PostgreSQL du test en dépend

Co-Authored-By: Claude Opus 5.5 <noreply@anthropic.com>

---------

Co-authored-by: Claude Opus 5.5 <noreply@anthropic.com>
</commit_message>
<xml_diff>
--- a/documents/modeles/bail_habitation.docx
+++ b/documents/modeles/bail_habitation.docx
@@ -231,7 +231,7 @@
           <w:sz w:val="20"/>
           <w:u w:val="none"/>
         </w:rPr>
-        <w:t>Représenté par son mandataire : URBIA IMMOBILIER, 302 avenue de Muret, 31300 Toulouse, exerçant l'activité de gestion immobilière, titulaire de la carte professionnelle CPI 3101 2017 000 016 956 délivrée par la CCI de la Haute-Garonne, garantie financière assurée par GALIAN, 89 rue La Boétie, 75008 Paris.</w:t>
+        <w:t xml:space="preserve">Représenté par son mandataire : {{ agence.nom|upper }}, {{ agence.adresse }}, {{ agence.code_postal }} {{ agence.ville }}, exerçant l'activité de gestion immobilière, titulaire de la carte professionnelle {{ agence.carte_pro }} délivrée par {{ agence.carte_delivree_par }}, garantie financière assurée par {{ agence.garant }}, {{ agence.garant_adresse }}.</w:t>
       </w:r>
     </w:p>
     <w:p>
@@ -5263,7 +5263,7 @@
               <w:b/>
               <w:color w:val="767171" w:themeColor="background2" w:themeShade="80"/>
             </w:rPr>
-            <w:t>URBIA IMMOBILIER</w:t>
+            <w:t xml:space="preserve">{{ agence.nom|upper }}</w:t>
           </w:r>
         </w:p>
         <w:p>
@@ -5284,7 +5284,7 @@
               <w:rFonts w:ascii="Blogger Sans Light" w:eastAsia="Calibri" w:hAnsi="Blogger Sans Light"/>
               <w:color w:val="767171" w:themeColor="background2" w:themeShade="80"/>
             </w:rPr>
-            <w:t>302 Avenue de Muret</w:t>
+            <w:t xml:space="preserve">{{ agence.adresse }}</w:t>
           </w:r>
         </w:p>
         <w:p>
@@ -5305,21 +5305,21 @@
               <w:rFonts w:ascii="Blogger Sans Light" w:eastAsia="Calibri" w:hAnsi="Blogger Sans Light"/>
               <w:color w:val="767171" w:themeColor="background2" w:themeShade="80"/>
             </w:rPr>
-            <w:t>31</w:t>
+            <w:t xml:space="preserve">{{ agence.code_postal }} {{ agence.ville|upper }}</w:t>
           </w:r>
           <w:r>
             <w:rPr>
               <w:rFonts w:ascii="Blogger Sans Light" w:eastAsia="Calibri" w:hAnsi="Blogger Sans Light"/>
               <w:color w:val="767171" w:themeColor="background2" w:themeShade="80"/>
             </w:rPr>
-            <w:t>3</w:t>
+            <w:t xml:space="preserve"/>
           </w:r>
           <w:r>
             <w:rPr>
               <w:rFonts w:ascii="Blogger Sans Light" w:eastAsia="Calibri" w:hAnsi="Blogger Sans Light"/>
               <w:color w:val="767171" w:themeColor="background2" w:themeShade="80"/>
             </w:rPr>
-            <w:t>00 TOULOUSE</w:t>
+            <w:t xml:space="preserve"/>
           </w:r>
         </w:p>
         <w:p>
@@ -5340,7 +5340,7 @@
               <w:rFonts w:ascii="Blogger Sans Light" w:eastAsia="Calibri" w:hAnsi="Blogger Sans Light"/>
               <w:color w:val="767171" w:themeColor="background2" w:themeShade="80"/>
             </w:rPr>
-            <w:t xml:space="preserve">                                         contact@urbia-immobilier.fr</w:t>
+            <w:t xml:space="preserve">                                         {{ agence.email }}</w:t>
           </w:r>
         </w:p>
         <w:p>
@@ -5440,14 +5440,14 @@
               <w:rFonts w:ascii="Calibri" w:eastAsia="Calibri" w:hAnsi="Calibri" w:cs="Calibri"/>
               <w:color w:val="767171" w:themeColor="background2" w:themeShade="80"/>
             </w:rPr>
-            <w:t> </w:t>
+            <w:t xml:space="preserve"> </w:t>
           </w:r>
           <w:r>
             <w:rPr>
               <w:rFonts w:ascii="Blogger Sans Light" w:eastAsia="Calibri" w:hAnsi="Blogger Sans Light"/>
               <w:color w:val="767171" w:themeColor="background2" w:themeShade="80"/>
             </w:rPr>
-            <w:t>05.32.26.15.25</w:t>
+            <w:t xml:space="preserve">{{ agence.telephone }}</w:t>
           </w:r>
         </w:p>
       </w:tc>

</xml_diff>

<commit_message>
Signature électronique des baux et mandats avec DocuSeal
L'étape Signature liste les signataires dans leur ordre de passage
(locataires ou mandant, puis l'agence) et envoie le PDF dans DocuSeal.
La page suit chaque signataire, avec une relance par ligne ; une fois
tout signé, le PDF signé est rangé sur le contrat et la date se remplit.
Retour par webhook et commande synchroniser_signatures. Sans
configuration DocuSeal, rien ne change.

Closes #84

Co-Authored-By: Claude Opus 5.5 (1M context) <noreply@anthropic.com>
Claude-Session: https://claude.ai/code/session_01GLojoLvP96Tb7BMcA8yMcg
</commit_message>
<xml_diff>
--- a/documents/modeles/bail_habitation.docx
+++ b/documents/modeles/bail_habitation.docx
@@ -3464,6 +3464,95 @@
         <w:tab/>
         <w:tab/>
         <w:t>précédée de la mention « lu et approuvé »</w:t>
+      </w:r>
+    </w:p>
+    <w:p>
+      <w:pPr>
+        <w:tabs>
+          <w:tab w:val="left" w:pos="5103"/>
+        </w:tabs>
+        <w:spacing w:before="0" w:after="0" w:line="240" w:lineRule="auto"/>
+        <w:rPr>
+          <w:sz w:val="4"/>
+        </w:rPr>
+      </w:pPr>
+      <w:r>
+        <w:rPr>
+          <w:rFonts w:ascii="Blogger Sans Light" w:hAnsi="Blogger Sans Light"/>
+          <w:color w:val="FFFFFF"/>
+          <w:sz w:val="4"/>
+          <w:szCs w:val="4"/>
+        </w:rPr>
+        <w:t xml:space="preserve">{{ signature_mandataire }}</w:t>
+      </w:r>
+    </w:p>
+    <w:p>
+      <w:pPr>
+        <w:tabs>
+          <w:tab w:val="left" w:pos="5103"/>
+        </w:tabs>
+        <w:spacing w:before="0" w:after="0" w:line="240" w:lineRule="auto"/>
+        <w:rPr>
+          <w:sz w:val="4"/>
+        </w:rPr>
+      </w:pPr>
+      <w:r>
+        <w:rPr>
+          <w:rFonts w:ascii="Blogger Sans Light" w:hAnsi="Blogger Sans Light"/>
+          <w:color w:val="FFFFFF"/>
+          <w:sz w:val="4"/>
+          <w:szCs w:val="4"/>
+        </w:rPr>
+        <w:t xml:space="preserve">{%p for signature in signatures_locataires %}</w:t>
+      </w:r>
+    </w:p>
+    <w:p>
+      <w:pPr>
+        <w:tabs>
+          <w:tab w:val="left" w:pos="5103"/>
+        </w:tabs>
+        <w:spacing w:before="0" w:after="1000" w:line="240" w:lineRule="auto"/>
+        <w:rPr>
+          <w:sz w:val="4"/>
+        </w:rPr>
+      </w:pPr>
+      <w:r>
+        <w:rPr>
+          <w:rFonts w:ascii="Blogger Sans Light" w:hAnsi="Blogger Sans Light"/>
+          <w:color w:val="FFFFFF"/>
+          <w:sz w:val="4"/>
+          <w:szCs w:val="4"/>
+        </w:rPr>
+        <w:tab/>
+      </w:r>
+      <w:r>
+        <w:rPr>
+          <w:rFonts w:ascii="Blogger Sans Light" w:hAnsi="Blogger Sans Light"/>
+          <w:color w:val="FFFFFF"/>
+          <w:sz w:val="4"/>
+          <w:szCs w:val="4"/>
+        </w:rPr>
+        <w:t xml:space="preserve">{{ signature }}</w:t>
+      </w:r>
+    </w:p>
+    <w:p>
+      <w:pPr>
+        <w:tabs>
+          <w:tab w:val="left" w:pos="5103"/>
+        </w:tabs>
+        <w:spacing w:before="0" w:after="0" w:line="240" w:lineRule="auto"/>
+        <w:rPr>
+          <w:sz w:val="4"/>
+        </w:rPr>
+      </w:pPr>
+      <w:r>
+        <w:rPr>
+          <w:rFonts w:ascii="Blogger Sans Light" w:hAnsi="Blogger Sans Light"/>
+          <w:color w:val="FFFFFF"/>
+          <w:sz w:val="4"/>
+          <w:szCs w:val="4"/>
+        </w:rPr>
+        <w:t xml:space="preserve">{%p endfor %}</w:t>
       </w:r>
     </w:p>
     <w:p>

</xml_diff>